<commit_message>
Figures taking shape, removed old recombination analyses
</commit_message>
<xml_diff>
--- a/Manuscript/SpurginBosse_Hapmap_SOM.docx
+++ b/Manuscript/SpurginBosse_Hapmap_SOM.docx
@@ -9,7 +9,19 @@
       <w:bookmarkStart w:id="21" w:name="supplementary-material-for-a-continental-scale-analysis-of-genomic-variation-in-a-songbird"/>
       <w:bookmarkEnd w:id="21"/>
       <w:r>
-        <w:t xml:space="preserve">Supplementary material for "A continental-scale analysis of genomic variation in a songbird"</w:t>
+        <w:t xml:space="preserve">Supplementary material for</w:t>
+      </w:r>
+      <w:r>
+        <w:t xml:space="preserve"> </w:t>
+      </w:r>
+      <w:r>
+        <w:t xml:space="preserve">“</w:t>
+      </w:r>
+      <w:r>
+        <w:t xml:space="preserve">A continental-scale analysis of genomic variation in a songbird</w:t>
+      </w:r>
+      <w:r>
+        <w:t xml:space="preserve">”</w:t>
       </w:r>
     </w:p>
     <w:p>
@@ -317,6 +329,163 @@
         <w:t xml:space="preserve">Proportion of relatedness explained among populations in relation to the number of migration events allowed in Treemix analyses.</w:t>
       </w:r>
     </w:p>
+    <w:p>
+      <w:pPr>
+        <w:pStyle w:val="BodyText"/>
+      </w:pPr>
+      <w:r>
+        <w:rPr>
+          <w:b/>
+        </w:rPr>
+        <w:t xml:space="preserve">Figure S5</w:t>
+      </w:r>
+      <w:r>
+        <w:t xml:space="preserve"> </w:t>
+      </w:r>
+      <w:r>
+        <w:drawing>
+          <wp:inline>
+            <wp:extent cx="5334000" cy="4000500"/>
+            <wp:effectExtent b="0" l="0" r="0" t="0"/>
+            <wp:docPr descr="" id="1" name="Picture"/>
+            <a:graphic>
+              <a:graphicData uri="http://schemas.openxmlformats.org/drawingml/2006/picture">
+                <pic:pic>
+                  <pic:nvPicPr>
+                    <pic:cNvPr descr="SpurginBosse_Hapmap_SOM_files/figure-docx/Figure%20S5-1.png" id="0" name="Picture"/>
+                    <pic:cNvPicPr>
+                      <a:picLocks noChangeArrowheads="1" noChangeAspect="1"/>
+                    </pic:cNvPicPr>
+                  </pic:nvPicPr>
+                  <pic:blipFill>
+                    <a:blip r:embed="rId26"/>
+                    <a:stretch>
+                      <a:fillRect/>
+                    </a:stretch>
+                  </pic:blipFill>
+                  <pic:spPr bwMode="auto">
+                    <a:xfrm>
+                      <a:off x="0" y="0"/>
+                      <a:ext cx="5334000" cy="4000500"/>
+                    </a:xfrm>
+                    <a:prstGeom prst="rect">
+                      <a:avLst/>
+                    </a:prstGeom>
+                    <a:noFill/>
+                    <a:ln w="9525">
+                      <a:noFill/>
+                      <a:headEnd/>
+                      <a:tailEnd/>
+                    </a:ln>
+                  </pic:spPr>
+                </pic:pic>
+              </a:graphicData>
+            </a:graphic>
+          </wp:inline>
+        </w:drawing>
+      </w:r>
+    </w:p>
+    <w:p>
+      <w:pPr>
+        <w:pStyle w:val="BodyText"/>
+      </w:pPr>
+      <w:r>
+        <w:rPr>
+          <w:b/>
+        </w:rPr>
+        <w:t xml:space="preserve">Figure S5</w:t>
+      </w:r>
+      <w:r>
+        <w:t xml:space="preserve"> </w:t>
+      </w:r>
+      <w:r>
+        <w:t xml:space="preserve">Landscapes of relative genomic differentiation in European great tit populations.</w:t>
+      </w:r>
+      <w:r>
+        <w:t xml:space="preserve"> </w:t>
+      </w:r>
+      <m:oMath>
+        <m:r>
+          <m:t>z</m:t>
+        </m:r>
+        <m:sSub>
+          <m:e>
+            <m:r>
+              <m:t>F</m:t>
+            </m:r>
+          </m:e>
+          <m:sub>
+            <m:r>
+              <m:t>S</m:t>
+            </m:r>
+            <m:r>
+              <m:t>T</m:t>
+            </m:r>
+          </m:sub>
+        </m:sSub>
+      </m:oMath>
+      <w:r>
+        <w:t xml:space="preserve"> </w:t>
+      </w:r>
+      <w:r>
+        <w:t xml:space="preserve">across the genome is averaged in 500kb windows, with each panel displaying a pairwise comparison between with the proposed refugial population in Turkey. Red lines represent</w:t>
+      </w:r>
+      <w:r>
+        <w:t xml:space="preserve"> </w:t>
+      </w:r>
+      <m:oMath>
+        <m:sSub>
+          <m:e>
+            <m:r>
+              <m:t>F</m:t>
+            </m:r>
+          </m:e>
+          <m:sub>
+            <m:r>
+              <m:t>S</m:t>
+            </m:r>
+            <m:r>
+              <m:t>T</m:t>
+            </m:r>
+          </m:sub>
+        </m:sSub>
+      </m:oMath>
+      <w:r>
+        <w:t xml:space="preserve"> </w:t>
+      </w:r>
+      <w:r>
+        <w:t xml:space="preserve">outliers (windows with mean</w:t>
+      </w:r>
+      <w:r>
+        <w:t xml:space="preserve"> </w:t>
+      </w:r>
+      <m:oMath>
+        <m:r>
+          <m:t>z</m:t>
+        </m:r>
+        <m:sSub>
+          <m:e>
+            <m:r>
+              <m:t>F</m:t>
+            </m:r>
+          </m:e>
+          <m:sub>
+            <m:r>
+              <m:t>S</m:t>
+            </m:r>
+            <m:r>
+              <m:t>T</m:t>
+            </m:r>
+          </m:sub>
+        </m:sSub>
+      </m:oMath>
+      <w:r>
+        <w:t xml:space="preserve"> </w:t>
+      </w:r>
+      <w:r>
+        <w:t xml:space="preserve">&gt; 10) shared across more than two comparisons (solid red lines), or unique to one or two comparisons (dashed red lines).</w:t>
+      </w:r>
+    </w:p>
     <w:sectPr/>
   </w:body>
 </w:document>
@@ -425,7 +594,7 @@
     </w:lvl>
   </w:abstractNum>
   <w:abstractNum w:abstractNumId="990">
-    <w:nsid w:val="eab05c83"/>
+    <w:nsid w:val="fbb8c3f7"/>
     <w:multiLevelType w:val="multilevel"/>
     <w:lvl w:ilvl="0">
       <w:numFmt w:val="bullet"/>

</xml_diff>

<commit_message>
Discussion written. Sent draft to coauthors. Pub.
</commit_message>
<xml_diff>
--- a/Manuscript/SpurginBosse_Hapmap_SOM.docx
+++ b/Manuscript/SpurginBosse_Hapmap_SOM.docx
@@ -27,6 +27,135 @@
     <w:p>
       <w:pPr>
         <w:pStyle w:val="FirstParagraph"/>
+      </w:pPr>
+      <w:r>
+        <w:rPr>
+          <w:b/>
+        </w:rPr>
+        <w:t xml:space="preserve">Table S1</w:t>
+      </w:r>
+      <w:r>
+        <w:t xml:space="preserve"> </w:t>
+      </w:r>
+      <w:r>
+        <w:t xml:space="preserve">Sampling details for the 28 European great tit populations.</w:t>
+      </w:r>
+    </w:p>
+    <w:p>
+      <w:pPr>
+        <w:pStyle w:val="BodyText"/>
+      </w:pPr>
+    </w:p>
+    <w:p>
+      <w:pPr>
+        <w:pStyle w:val="BodyText"/>
+      </w:pPr>
+      <w:r>
+        <w:rPr>
+          <w:b/>
+        </w:rPr>
+        <w:t xml:space="preserve">Table S2</w:t>
+      </w:r>
+      <w:r>
+        <w:t xml:space="preserve"> </w:t>
+      </w:r>
+      <w:r>
+        <w:t xml:space="preserve">Details of outlier</w:t>
+      </w:r>
+      <w:r>
+        <w:t xml:space="preserve"> </w:t>
+      </w:r>
+      <m:oMath>
+        <m:sSub>
+          <m:e>
+            <m:r>
+              <m:t>F</m:t>
+            </m:r>
+          </m:e>
+          <m:sub>
+            <m:r>
+              <m:t>S</m:t>
+            </m:r>
+            <m:r>
+              <m:t>T</m:t>
+            </m:r>
+          </m:sub>
+        </m:sSub>
+      </m:oMath>
+      <w:r>
+        <w:t xml:space="preserve"> </w:t>
+      </w:r>
+      <w:r>
+        <w:t xml:space="preserve">regions in European great tit populations. For each region,</w:t>
+      </w:r>
+      <w:r>
+        <w:t xml:space="preserve"> </w:t>
+      </w:r>
+      <m:oMath>
+        <m:sSub>
+          <m:e>
+            <m:r>
+              <m:t>F</m:t>
+            </m:r>
+          </m:e>
+          <m:sub>
+            <m:r>
+              <m:t>S</m:t>
+            </m:r>
+            <m:r>
+              <m:t>T</m:t>
+            </m:r>
+          </m:sub>
+        </m:sSub>
+      </m:oMath>
+      <w:r>
+        <w:t xml:space="preserve"> </w:t>
+      </w:r>
+      <w:r>
+        <w:t xml:space="preserve">was calculated for each population versus Turkey. The</w:t>
+      </w:r>
+      <w:r>
+        <w:t xml:space="preserve"> </w:t>
+      </w:r>
+      <w:r>
+        <w:t xml:space="preserve">“</w:t>
+      </w:r>
+      <w:r>
+        <w:t xml:space="preserve">number of outliers represents</w:t>
+      </w:r>
+      <w:r>
+        <w:t xml:space="preserve">”</w:t>
+      </w:r>
+      <w:r>
+        <w:t xml:space="preserve"> </w:t>
+      </w:r>
+      <w:r>
+        <w:t xml:space="preserve">the number of</w:t>
+      </w:r>
+      <w:r>
+        <w:t xml:space="preserve"> </w:t>
+      </w:r>
+      <w:r>
+        <w:rPr>
+          <w:i/>
+        </w:rPr>
+        <w:t xml:space="preserve">populations</w:t>
+      </w:r>
+      <w:r>
+        <w:t xml:space="preserve"> </w:t>
+      </w:r>
+      <w:r>
+        <w:t xml:space="preserve">in which each region was detected as an outlier.</w:t>
+      </w:r>
+    </w:p>
+    <w:p>
+      <w:pPr>
+        <w:pStyle w:val="BodyText"/>
+      </w:pPr>
+    </w:p>
+    <w:p>
+      <w:pPr>
+        <w:pStyle w:val="BodyText"/>
       </w:pPr>
       <w:r>
         <w:drawing>
@@ -115,10 +244,15 @@
       <w:pPr>
         <w:pStyle w:val="BodyText"/>
       </w:pPr>
+    </w:p>
+    <w:p>
+      <w:pPr>
+        <w:pStyle w:val="BodyText"/>
+      </w:pPr>
       <w:r>
         <w:drawing>
           <wp:inline>
-            <wp:extent cx="5334000" cy="9144000"/>
+            <wp:extent cx="5334000" cy="7620000"/>
             <wp:effectExtent b="0" l="0" r="0" t="0"/>
             <wp:docPr descr="" id="1" name="Picture"/>
             <a:graphic>
@@ -139,7 +273,7 @@
                   <pic:spPr bwMode="auto">
                     <a:xfrm>
                       <a:off x="0" y="0"/>
-                      <a:ext cx="5334000" cy="9144000"/>
+                      <a:ext cx="5334000" cy="7620000"/>
                     </a:xfrm>
                     <a:prstGeom prst="rect">
                       <a:avLst/>
@@ -157,9 +291,11 @@
           </wp:inline>
         </w:drawing>
       </w:r>
-      <w:r>
-        <w:t xml:space="preserve"> </w:t>
-      </w:r>
+    </w:p>
+    <w:p>
+      <w:pPr>
+        <w:pStyle w:val="BodyText"/>
+      </w:pPr>
       <w:r>
         <w:rPr>
           <w:b/>
@@ -186,6 +322,11 @@
       <w:r>
         <w:t xml:space="preserve">= 2 to 10 in European Great tit populations.</w:t>
       </w:r>
+    </w:p>
+    <w:p>
+      <w:pPr>
+        <w:pStyle w:val="BodyText"/>
+      </w:pPr>
     </w:p>
     <w:p>
       <w:pPr>
@@ -269,6 +410,11 @@
       <w:pPr>
         <w:pStyle w:val="BodyText"/>
       </w:pPr>
+    </w:p>
+    <w:p>
+      <w:pPr>
+        <w:pStyle w:val="BodyText"/>
+      </w:pPr>
       <w:r>
         <w:drawing>
           <wp:inline>
@@ -333,15 +479,11 @@
       <w:pPr>
         <w:pStyle w:val="BodyText"/>
       </w:pPr>
-      <w:r>
-        <w:rPr>
-          <w:b/>
-        </w:rPr>
-        <w:t xml:space="preserve">Figure S5</w:t>
-      </w:r>
-      <w:r>
-        <w:t xml:space="preserve"> </w:t>
-      </w:r>
+    </w:p>
+    <w:p>
+      <w:pPr>
+        <w:pStyle w:val="BodyText"/>
+      </w:pPr>
       <w:r>
         <w:drawing>
           <wp:inline>
@@ -594,7 +736,7 @@
     </w:lvl>
   </w:abstractNum>
   <w:abstractNum w:abstractNumId="990">
-    <w:nsid w:val="fbb8c3f7"/>
+    <w:nsid w:val="4bd19219"/>
     <w:multiLevelType w:val="multilevel"/>
     <w:lvl w:ilvl="0">
       <w:numFmt w:val="bullet"/>

</xml_diff>

<commit_message>
Started combining results and discussion. More of Jon's edits.
</commit_message>
<xml_diff>
--- a/Manuscript/SpurginBosse_Hapmap_SOM.docx
+++ b/Manuscript/SpurginBosse_Hapmap_SOM.docx
@@ -162,7 +162,7 @@
           <wp:inline>
             <wp:extent cx="5334000" cy="5334000"/>
             <wp:effectExtent b="0" l="0" r="0" t="0"/>
-            <wp:docPr descr="" id="1" name="Picture"/>
+            <wp:docPr descr="" title="" id="1" name="Picture"/>
             <a:graphic>
               <a:graphicData uri="http://schemas.openxmlformats.org/drawingml/2006/picture">
                 <pic:pic>
@@ -252,9 +252,9 @@
       <w:r>
         <w:drawing>
           <wp:inline>
-            <wp:extent cx="5334000" cy="7620000"/>
+            <wp:extent cx="5334000" cy="5334000"/>
             <wp:effectExtent b="0" l="0" r="0" t="0"/>
-            <wp:docPr descr="" id="1" name="Picture"/>
+            <wp:docPr descr="" title="" id="1" name="Picture"/>
             <a:graphic>
               <a:graphicData uri="http://schemas.openxmlformats.org/drawingml/2006/picture">
                 <pic:pic>
@@ -266,6 +266,101 @@
                   </pic:nvPicPr>
                   <pic:blipFill>
                     <a:blip r:embed="rId23"/>
+                    <a:stretch>
+                      <a:fillRect/>
+                    </a:stretch>
+                  </pic:blipFill>
+                  <pic:spPr bwMode="auto">
+                    <a:xfrm>
+                      <a:off x="0" y="0"/>
+                      <a:ext cx="5334000" cy="5334000"/>
+                    </a:xfrm>
+                    <a:prstGeom prst="rect">
+                      <a:avLst/>
+                    </a:prstGeom>
+                    <a:noFill/>
+                    <a:ln w="9525">
+                      <a:noFill/>
+                      <a:headEnd/>
+                      <a:tailEnd/>
+                    </a:ln>
+                  </pic:spPr>
+                </pic:pic>
+              </a:graphicData>
+            </a:graphic>
+          </wp:inline>
+        </w:drawing>
+      </w:r>
+    </w:p>
+    <w:p>
+      <w:pPr>
+        <w:pStyle w:val="BodyText"/>
+      </w:pPr>
+      <w:r>
+        <w:rPr>
+          <w:b/>
+        </w:rPr>
+        <w:t xml:space="preserve">Figure S2</w:t>
+      </w:r>
+      <w:r>
+        <w:t xml:space="preserve"> </w:t>
+      </w:r>
+      <w:r>
+        <w:t xml:space="preserve">Pairwise</w:t>
+      </w:r>
+      <w:r>
+        <w:t xml:space="preserve"> </w:t>
+      </w:r>
+      <m:oMath>
+        <m:sSub>
+          <m:e>
+            <m:r>
+              <m:t>F</m:t>
+            </m:r>
+          </m:e>
+          <m:sub>
+            <m:r>
+              <m:t>S</m:t>
+            </m:r>
+            <m:r>
+              <m:t>T</m:t>
+            </m:r>
+          </m:sub>
+        </m:sSub>
+      </m:oMath>
+      <w:r>
+        <w:t xml:space="preserve"> </w:t>
+      </w:r>
+      <w:r>
+        <w:t xml:space="preserve">in relation to geographic distance among European great tit populations. Pairwise comparisons involving the island populations of Corsica, Sardinia and Crete are coloured in dark blue.</w:t>
+      </w:r>
+    </w:p>
+    <w:p>
+      <w:pPr>
+        <w:pStyle w:val="BodyText"/>
+      </w:pPr>
+    </w:p>
+    <w:p>
+      <w:pPr>
+        <w:pStyle w:val="BodyText"/>
+      </w:pPr>
+      <w:r>
+        <w:drawing>
+          <wp:inline>
+            <wp:extent cx="5334000" cy="7620000"/>
+            <wp:effectExtent b="0" l="0" r="0" t="0"/>
+            <wp:docPr descr="" title="" id="1" name="Picture"/>
+            <a:graphic>
+              <a:graphicData uri="http://schemas.openxmlformats.org/drawingml/2006/picture">
+                <pic:pic>
+                  <pic:nvPicPr>
+                    <pic:cNvPr descr="SpurginBosse_Hapmap_SOM_files/figure-docx/FigS3-1.png" id="0" name="Picture"/>
+                    <pic:cNvPicPr>
+                      <a:picLocks noChangeArrowheads="1" noChangeAspect="1"/>
+                    </pic:cNvPicPr>
+                  </pic:nvPicPr>
+                  <pic:blipFill>
+                    <a:blip r:embed="rId24"/>
                     <a:stretch>
                       <a:fillRect/>
                     </a:stretch>
@@ -300,7 +395,7 @@
         <w:rPr>
           <w:b/>
         </w:rPr>
-        <w:t xml:space="preserve">Figure S2</w:t>
+        <w:t xml:space="preserve">Figure S3</w:t>
       </w:r>
       <w:r>
         <w:t xml:space="preserve"> </w:t>
@@ -337,95 +432,12 @@
           <wp:inline>
             <wp:extent cx="5334000" cy="5334000"/>
             <wp:effectExtent b="0" l="0" r="0" t="0"/>
-            <wp:docPr descr="" id="1" name="Picture"/>
+            <wp:docPr descr="" title="" id="1" name="Picture"/>
             <a:graphic>
               <a:graphicData uri="http://schemas.openxmlformats.org/drawingml/2006/picture">
                 <pic:pic>
                   <pic:nvPicPr>
-                    <pic:cNvPr descr="SpurginBosse_Hapmap_SOM_files/figure-docx/FigS3-1.png" id="0" name="Picture"/>
-                    <pic:cNvPicPr>
-                      <a:picLocks noChangeArrowheads="1" noChangeAspect="1"/>
-                    </pic:cNvPicPr>
-                  </pic:nvPicPr>
-                  <pic:blipFill>
-                    <a:blip r:embed="rId24"/>
-                    <a:stretch>
-                      <a:fillRect/>
-                    </a:stretch>
-                  </pic:blipFill>
-                  <pic:spPr bwMode="auto">
-                    <a:xfrm>
-                      <a:off x="0" y="0"/>
-                      <a:ext cx="5334000" cy="5334000"/>
-                    </a:xfrm>
-                    <a:prstGeom prst="rect">
-                      <a:avLst/>
-                    </a:prstGeom>
-                    <a:noFill/>
-                    <a:ln w="9525">
-                      <a:noFill/>
-                      <a:headEnd/>
-                      <a:tailEnd/>
-                    </a:ln>
-                  </pic:spPr>
-                </pic:pic>
-              </a:graphicData>
-            </a:graphic>
-          </wp:inline>
-        </w:drawing>
-      </w:r>
-    </w:p>
-    <w:p>
-      <w:pPr>
-        <w:pStyle w:val="BodyText"/>
-      </w:pPr>
-      <w:r>
-        <w:rPr>
-          <w:b/>
-        </w:rPr>
-        <w:t xml:space="preserve">Figure S3</w:t>
-      </w:r>
-      <w:r>
-        <w:t xml:space="preserve"> </w:t>
-      </w:r>
-      <w:r>
-        <w:t xml:space="preserve">Cross-validation error from admixture analyses at</w:t>
-      </w:r>
-      <w:r>
-        <w:t xml:space="preserve"> </w:t>
-      </w:r>
-      <m:oMath>
-        <m:r>
-          <m:t>K</m:t>
-        </m:r>
-      </m:oMath>
-      <w:r>
-        <w:t xml:space="preserve"> </w:t>
-      </w:r>
-      <w:r>
-        <w:t xml:space="preserve">= 1 to 10.</w:t>
-      </w:r>
-    </w:p>
-    <w:p>
-      <w:pPr>
-        <w:pStyle w:val="BodyText"/>
-      </w:pPr>
-    </w:p>
-    <w:p>
-      <w:pPr>
-        <w:pStyle w:val="BodyText"/>
-      </w:pPr>
-      <w:r>
-        <w:drawing>
-          <wp:inline>
-            <wp:extent cx="5334000" cy="5334000"/>
-            <wp:effectExtent b="0" l="0" r="0" t="0"/>
-            <wp:docPr descr="" id="1" name="Picture"/>
-            <a:graphic>
-              <a:graphicData uri="http://schemas.openxmlformats.org/drawingml/2006/picture">
-                <pic:pic>
-                  <pic:nvPicPr>
-                    <pic:cNvPr descr="SpurginBosse_Hapmap_SOM_files/figure-docx/Fig%20S4-1.png" id="0" name="Picture"/>
+                    <pic:cNvPr descr="SpurginBosse_Hapmap_SOM_files/figure-docx/FigS4-1.png" id="0" name="Picture"/>
                     <pic:cNvPicPr>
                       <a:picLocks noChangeArrowheads="1" noChangeAspect="1"/>
                     </pic:cNvPicPr>
@@ -472,7 +484,21 @@
         <w:t xml:space="preserve"> </w:t>
       </w:r>
       <w:r>
-        <w:t xml:space="preserve">Proportion of relatedness explained among populations in relation to the number of migration events allowed in Treemix analyses.</w:t>
+        <w:t xml:space="preserve">Cross-validation error from admixture analyses at</w:t>
+      </w:r>
+      <w:r>
+        <w:t xml:space="preserve"> </w:t>
+      </w:r>
+      <m:oMath>
+        <m:r>
+          <m:t>K</m:t>
+        </m:r>
+      </m:oMath>
+      <w:r>
+        <w:t xml:space="preserve"> </w:t>
+      </w:r>
+      <w:r>
+        <w:t xml:space="preserve">= 1 to 10.</w:t>
       </w:r>
     </w:p>
     <w:p>
@@ -487,20 +513,89 @@
       <w:r>
         <w:drawing>
           <wp:inline>
-            <wp:extent cx="5334000" cy="4000500"/>
+            <wp:extent cx="5334000" cy="5334000"/>
             <wp:effectExtent b="0" l="0" r="0" t="0"/>
-            <wp:docPr descr="" id="1" name="Picture"/>
+            <wp:docPr descr="" title="" id="1" name="Picture"/>
             <a:graphic>
               <a:graphicData uri="http://schemas.openxmlformats.org/drawingml/2006/picture">
                 <pic:pic>
                   <pic:nvPicPr>
-                    <pic:cNvPr descr="SpurginBosse_Hapmap_SOM_files/figure-docx/Figure%20S5-1.png" id="0" name="Picture"/>
+                    <pic:cNvPr descr="SpurginBosse_Hapmap_SOM_files/figure-docx/Fig%20S5-1.png" id="0" name="Picture"/>
                     <pic:cNvPicPr>
                       <a:picLocks noChangeArrowheads="1" noChangeAspect="1"/>
                     </pic:cNvPicPr>
                   </pic:nvPicPr>
                   <pic:blipFill>
                     <a:blip r:embed="rId26"/>
+                    <a:stretch>
+                      <a:fillRect/>
+                    </a:stretch>
+                  </pic:blipFill>
+                  <pic:spPr bwMode="auto">
+                    <a:xfrm>
+                      <a:off x="0" y="0"/>
+                      <a:ext cx="5334000" cy="5334000"/>
+                    </a:xfrm>
+                    <a:prstGeom prst="rect">
+                      <a:avLst/>
+                    </a:prstGeom>
+                    <a:noFill/>
+                    <a:ln w="9525">
+                      <a:noFill/>
+                      <a:headEnd/>
+                      <a:tailEnd/>
+                    </a:ln>
+                  </pic:spPr>
+                </pic:pic>
+              </a:graphicData>
+            </a:graphic>
+          </wp:inline>
+        </w:drawing>
+      </w:r>
+    </w:p>
+    <w:p>
+      <w:pPr>
+        <w:pStyle w:val="BodyText"/>
+      </w:pPr>
+      <w:r>
+        <w:rPr>
+          <w:b/>
+        </w:rPr>
+        <w:t xml:space="preserve">Figure S5</w:t>
+      </w:r>
+      <w:r>
+        <w:t xml:space="preserve"> </w:t>
+      </w:r>
+      <w:r>
+        <w:t xml:space="preserve">Proportion of relatedness explained among populations in relation to the number of migration events allowed in Treemix analyses.</w:t>
+      </w:r>
+    </w:p>
+    <w:p>
+      <w:pPr>
+        <w:pStyle w:val="BodyText"/>
+      </w:pPr>
+    </w:p>
+    <w:p>
+      <w:pPr>
+        <w:pStyle w:val="BodyText"/>
+      </w:pPr>
+      <w:r>
+        <w:drawing>
+          <wp:inline>
+            <wp:extent cx="5334000" cy="4000500"/>
+            <wp:effectExtent b="0" l="0" r="0" t="0"/>
+            <wp:docPr descr="" title="" id="1" name="Picture"/>
+            <a:graphic>
+              <a:graphicData uri="http://schemas.openxmlformats.org/drawingml/2006/picture">
+                <pic:pic>
+                  <pic:nvPicPr>
+                    <pic:cNvPr descr="SpurginBosse_Hapmap_SOM_files/figure-docx/Figure%20S6-1.png" id="0" name="Picture"/>
+                    <pic:cNvPicPr>
+                      <a:picLocks noChangeArrowheads="1" noChangeAspect="1"/>
+                    </pic:cNvPicPr>
+                  </pic:nvPicPr>
+                  <pic:blipFill>
+                    <a:blip r:embed="rId27"/>
                     <a:stretch>
                       <a:fillRect/>
                     </a:stretch>
@@ -535,7 +630,7 @@
         <w:rPr>
           <w:b/>
         </w:rPr>
-        <w:t xml:space="preserve">Figure S5</w:t>
+        <w:t xml:space="preserve">Figure S6</w:t>
       </w:r>
       <w:r>
         <w:t xml:space="preserve"> </w:t>
@@ -736,7 +831,7 @@
     </w:lvl>
   </w:abstractNum>
   <w:abstractNum w:abstractNumId="990">
-    <w:nsid w:val="4bd19219"/>
+    <w:nsid w:val="a6ca5ca0"/>
     <w:multiLevelType w:val="multilevel"/>
     <w:lvl w:ilvl="0">
       <w:numFmt w:val="bullet"/>

</xml_diff>

<commit_message>
Added PCA, Mirtes figure
</commit_message>
<xml_diff>
--- a/Manuscript/SpurginBosse_Hapmap_SOM.docx
+++ b/Manuscript/SpurginBosse_Hapmap_SOM.docx
@@ -6,7 +6,7 @@
       <w:pPr>
         <w:pStyle w:val="Heading1"/>
       </w:pPr>
-      <w:bookmarkStart w:id="21" w:name="supplementary-material-for-a-continental-scale-analysis-of-genomic-variation-in-a-songbird"/>
+      <w:bookmarkStart w:id="21" w:name="supplementary-material-for-the-great-tit-hapmap-project-a-continental-scale-analysis-of-genomic-variation-in-a-songbird"/>
       <w:bookmarkEnd w:id="21"/>
       <w:r>
         <w:t xml:space="preserve">Supplementary material for</w:t>
@@ -18,7 +18,7 @@
         <w:t xml:space="preserve">“</w:t>
       </w:r>
       <w:r>
-        <w:t xml:space="preserve">A continental-scale analysis of genomic variation in a songbird</w:t>
+        <w:t xml:space="preserve">The great tit HapMap project: a continental-scale analysis of genomic variation in a songbird</w:t>
       </w:r>
       <w:r>
         <w:t xml:space="preserve">”</w:t>
@@ -513,6 +513,75 @@
       <w:r>
         <w:drawing>
           <wp:inline>
+            <wp:extent cx="5334000" cy="7467600"/>
+            <wp:effectExtent b="0" l="0" r="0" t="0"/>
+            <wp:docPr descr="" title="" id="1" name="Picture"/>
+            <a:graphic>
+              <a:graphicData uri="http://schemas.openxmlformats.org/drawingml/2006/picture">
+                <pic:pic>
+                  <pic:nvPicPr>
+                    <pic:cNvPr descr="SpurginBosse_Hapmap_SOM_files/figure-docx/FigS5-1.png" id="0" name="Picture"/>
+                    <pic:cNvPicPr>
+                      <a:picLocks noChangeArrowheads="1" noChangeAspect="1"/>
+                    </pic:cNvPicPr>
+                  </pic:nvPicPr>
+                  <pic:blipFill>
+                    <a:blip r:embed="rId26"/>
+                    <a:stretch>
+                      <a:fillRect/>
+                    </a:stretch>
+                  </pic:blipFill>
+                  <pic:spPr bwMode="auto">
+                    <a:xfrm>
+                      <a:off x="0" y="0"/>
+                      <a:ext cx="5334000" cy="7467600"/>
+                    </a:xfrm>
+                    <a:prstGeom prst="rect">
+                      <a:avLst/>
+                    </a:prstGeom>
+                    <a:noFill/>
+                    <a:ln w="9525">
+                      <a:noFill/>
+                      <a:headEnd/>
+                      <a:tailEnd/>
+                    </a:ln>
+                  </pic:spPr>
+                </pic:pic>
+              </a:graphicData>
+            </a:graphic>
+          </wp:inline>
+        </w:drawing>
+      </w:r>
+    </w:p>
+    <w:p>
+      <w:pPr>
+        <w:pStyle w:val="BodyText"/>
+      </w:pPr>
+      <w:r>
+        <w:rPr>
+          <w:b/>
+        </w:rPr>
+        <w:t xml:space="preserve">Figure S5</w:t>
+      </w:r>
+      <w:r>
+        <w:t xml:space="preserve"> </w:t>
+      </w:r>
+      <w:r>
+        <w:t xml:space="preserve">Results from PCA analysis of European great tit populations.</w:t>
+      </w:r>
+    </w:p>
+    <w:p>
+      <w:pPr>
+        <w:pStyle w:val="BodyText"/>
+      </w:pPr>
+    </w:p>
+    <w:p>
+      <w:pPr>
+        <w:pStyle w:val="BodyText"/>
+      </w:pPr>
+      <w:r>
+        <w:drawing>
+          <wp:inline>
             <wp:extent cx="5334000" cy="5334000"/>
             <wp:effectExtent b="0" l="0" r="0" t="0"/>
             <wp:docPr descr="" title="" id="1" name="Picture"/>
@@ -520,13 +589,13 @@
               <a:graphicData uri="http://schemas.openxmlformats.org/drawingml/2006/picture">
                 <pic:pic>
                   <pic:nvPicPr>
-                    <pic:cNvPr descr="SpurginBosse_Hapmap_SOM_files/figure-docx/Fig%20S5-1.png" id="0" name="Picture"/>
+                    <pic:cNvPr descr="SpurginBosse_Hapmap_SOM_files/figure-docx/Fig%20S6-1.png" id="0" name="Picture"/>
                     <pic:cNvPicPr>
                       <a:picLocks noChangeArrowheads="1" noChangeAspect="1"/>
                     </pic:cNvPicPr>
                   </pic:nvPicPr>
                   <pic:blipFill>
-                    <a:blip r:embed="rId26"/>
+                    <a:blip r:embed="rId27"/>
                     <a:stretch>
                       <a:fillRect/>
                     </a:stretch>
@@ -561,7 +630,7 @@
         <w:rPr>
           <w:b/>
         </w:rPr>
-        <w:t xml:space="preserve">Figure S5</w:t>
+        <w:t xml:space="preserve">Figure S6</w:t>
       </w:r>
       <w:r>
         <w:t xml:space="preserve"> </w:t>
@@ -595,7 +664,7 @@
                     </pic:cNvPicPr>
                   </pic:nvPicPr>
                   <pic:blipFill>
-                    <a:blip r:embed="rId27"/>
+                    <a:blip r:embed="rId28"/>
                     <a:stretch>
                       <a:fillRect/>
                     </a:stretch>
@@ -630,7 +699,7 @@
         <w:rPr>
           <w:b/>
         </w:rPr>
-        <w:t xml:space="preserve">Figure S6</w:t>
+        <w:t xml:space="preserve">Figure S7</w:t>
       </w:r>
       <w:r>
         <w:t xml:space="preserve"> </w:t>
@@ -723,6 +792,93 @@
         <w:t xml:space="preserve">&gt; 10) shared across more than two comparisons (solid red lines), or unique to one or two comparisons (dashed red lines).</w:t>
       </w:r>
     </w:p>
+    <w:p>
+      <w:pPr>
+        <w:pStyle w:val="BodyText"/>
+      </w:pPr>
+    </w:p>
+    <w:p>
+      <w:pPr>
+        <w:pStyle w:val="BodyText"/>
+      </w:pPr>
+    </w:p>
+    <w:p>
+      <w:pPr>
+        <w:pStyle w:val="BodyText"/>
+      </w:pPr>
+      <w:r>
+        <w:rPr>
+          <w:b/>
+        </w:rPr>
+        <w:t xml:space="preserve">Figure S8</w:t>
+      </w:r>
+      <w:r>
+        <w:t xml:space="preserve"> </w:t>
+      </w:r>
+      <w:r>
+        <w:t xml:space="preserve">Haplotype structure underlying regions of high differentiation.</w:t>
+      </w:r>
+      <w:r>
+        <w:t xml:space="preserve"> </w:t>
+      </w:r>
+      <w:r>
+        <w:rPr>
+          <w:b/>
+        </w:rPr>
+        <w:t xml:space="preserve">A</w:t>
+      </w:r>
+      <w:r>
+        <w:t xml:space="preserve"> </w:t>
+      </w:r>
+      <w:r>
+        <w:t xml:space="preserve">IBS clustering of all European haplotypes in the region containing a signal of high differentiation with Turkey specific to the Oulu population. The red arrow indicates the haplotype at highest frequency in Oulu. Colour indicates IBS similarity (range 0:white - 1: dark blue).</w:t>
+      </w:r>
+      <w:r>
+        <w:t xml:space="preserve"> </w:t>
+      </w:r>
+      <w:r>
+        <w:rPr>
+          <w:b/>
+        </w:rPr>
+        <w:t xml:space="preserve">B</w:t>
+      </w:r>
+      <w:r>
+        <w:t xml:space="preserve"> </w:t>
+      </w:r>
+      <w:r>
+        <w:t xml:space="preserve">IBS clustering of all European haplotypes in the region on chromosome 2 containing a signal of high differentiation with Turkey in multiple populations.</w:t>
+      </w:r>
+      <w:r>
+        <w:t xml:space="preserve"> </w:t>
+      </w:r>
+      <w:r>
+        <w:rPr>
+          <w:b/>
+        </w:rPr>
+        <w:t xml:space="preserve">C</w:t>
+      </w:r>
+      <w:r>
+        <w:t xml:space="preserve"> </w:t>
+      </w:r>
+      <w:r>
+        <w:t xml:space="preserve">Frequency of all identified haplotypes within each population. The red arrow indicates the high-frequency haplotype within Oulu.</w:t>
+      </w:r>
+      <w:r>
+        <w:t xml:space="preserve"> </w:t>
+      </w:r>
+      <w:r>
+        <w:rPr>
+          <w:b/>
+        </w:rPr>
+        <w:t xml:space="preserve">D</w:t>
+      </w:r>
+      <w:r>
+        <w:t xml:space="preserve"> </w:t>
+      </w:r>
+      <w:r>
+        <w:t xml:space="preserve">Frequency of all identified haplotypes spanning the region on chromosome 2 within each population.</w:t>
+      </w:r>
+    </w:p>
     <w:sectPr/>
   </w:body>
 </w:document>
@@ -831,7 +987,7 @@
     </w:lvl>
   </w:abstractNum>
   <w:abstractNum w:abstractNumId="990">
-    <w:nsid w:val="a6ca5ca0"/>
+    <w:nsid w:val="a87268c0"/>
     <w:multiLevelType w:val="multilevel"/>
     <w:lvl w:ilvl="0">
       <w:numFmt w:val="bullet"/>

</xml_diff>